<commit_message>
3rd place not 2nd for the cuttlefish lights
</commit_message>
<xml_diff>
--- a/temp/2026Resume.docx
+++ b/temp/2026Resume.docx
@@ -1,6 +1,6 @@
 
 <file path=word/document.xml><?xml version="1.0" encoding="utf-8"?>
-<w:document xmlns:wpc="http://schemas.microsoft.com/office/word/2010/wordprocessingCanvas" xmlns:cx="http://schemas.microsoft.com/office/drawing/2014/chartex" xmlns:cx1="http://schemas.microsoft.com/office/drawing/2015/9/8/chartex" xmlns:cx2="http://schemas.microsoft.com/office/drawing/2015/10/21/chartex" xmlns:cx3="http://schemas.microsoft.com/office/drawing/2016/5/9/chartex" xmlns:cx4="http://schemas.microsoft.com/office/drawing/2016/5/10/chartex" xmlns:cx5="http://schemas.microsoft.com/office/drawing/2016/5/11/chartex" xmlns:cx6="http://schemas.microsoft.com/office/drawing/2016/5/12/chartex" xmlns:cx7="http://schemas.microsoft.com/office/drawing/2016/5/13/chartex" xmlns:cx8="http://schemas.microsoft.com/office/drawing/2016/5/14/chartex" xmlns:mc="http://schemas.openxmlformats.org/markup-compatibility/2006" xmlns:aink="http://schemas.microsoft.com/office/drawing/2016/ink" xmlns:am3d="http://schemas.microsoft.com/office/drawing/2017/model3d" xmlns:o="urn:schemas-microsoft-com:office:office" xmlns:oel="http://schemas.microsoft.com/office/2019/extlst" xmlns:r="http://schemas.openxmlformats.org/officeDocument/2006/relationships" xmlns:m="http://schemas.openxmlformats.org/officeDocument/2006/math" xmlns:v="urn:schemas-microsoft-com:vml" xmlns:wp14="http://schemas.microsoft.com/office/word/2010/wordprocessingDrawing" xmlns:wp="http://schemas.openxmlformats.org/drawingml/2006/wordprocessingDrawing" xmlns:w10="urn:schemas-microsoft-com:office:word" xmlns:w="http://schemas.openxmlformats.org/wordprocessingml/2006/main" xmlns:w14="http://schemas.microsoft.com/office/word/2010/wordml" xmlns:w15="http://schemas.microsoft.com/office/word/2012/wordml" xmlns:w16cex="http://schemas.microsoft.com/office/word/2018/wordml/cex" xmlns:w16cid="http://schemas.microsoft.com/office/word/2016/wordml/cid" xmlns:w16="http://schemas.microsoft.com/office/word/2018/wordml" xmlns:w16du="http://schemas.microsoft.com/office/word/2023/wordml/word16du" xmlns:w16sdtdh="http://schemas.microsoft.com/office/word/2020/wordml/sdtdatahash" xmlns:w16sdtfl="http://schemas.microsoft.com/office/word/2024/wordml/sdtformatlock" xmlns:w16se="http://schemas.microsoft.com/office/word/2015/wordml/symex" xmlns:wpg="http://schemas.microsoft.com/office/word/2010/wordprocessingGroup" xmlns:wpi="http://schemas.microsoft.com/office/word/2010/wordprocessingInk" xmlns:wne="http://schemas.microsoft.com/office/word/2006/wordml" xmlns:wps="http://schemas.microsoft.com/office/word/2010/wordprocessingShape" mc:Ignorable="w14 w15 w16se w16cid w16 w16cex w16sdtdh w16sdtfl w16du wp14">
+<w:document xmlns:wpc="http://schemas.microsoft.com/office/word/2010/wordprocessingCanvas" xmlns:cx="http://schemas.microsoft.com/office/drawing/2014/chartex" xmlns:cx1="http://schemas.microsoft.com/office/drawing/2015/9/8/chartex" xmlns:cx2="http://schemas.microsoft.com/office/drawing/2015/10/21/chartex" xmlns:cx3="http://schemas.microsoft.com/office/drawing/2016/5/9/chartex" xmlns:cx4="http://schemas.microsoft.com/office/drawing/2016/5/10/chartex" xmlns:cx5="http://schemas.microsoft.com/office/drawing/2016/5/11/chartex" xmlns:cx6="http://schemas.microsoft.com/office/drawing/2016/5/12/chartex" xmlns:cx7="http://schemas.microsoft.com/office/drawing/2016/5/13/chartex" xmlns:cx8="http://schemas.microsoft.com/office/drawing/2016/5/14/chartex" xmlns:mc="http://schemas.openxmlformats.org/markup-compatibility/2006" xmlns:aink="http://schemas.microsoft.com/office/drawing/2016/ink" xmlns:am3d="http://schemas.microsoft.com/office/drawing/2017/model3d" xmlns:o="urn:schemas-microsoft-com:office:office" xmlns:oel="http://schemas.microsoft.com/office/2019/extlst" xmlns:r="http://schemas.openxmlformats.org/officeDocument/2006/relationships" xmlns:m="http://schemas.openxmlformats.org/officeDocument/2006/math" xmlns:v="urn:schemas-microsoft-com:vml" xmlns:wp14="http://schemas.microsoft.com/office/word/2010/wordprocessingDrawing" xmlns:wp="http://schemas.openxmlformats.org/drawingml/2006/wordprocessingDrawing" xmlns:w10="urn:schemas-microsoft-com:office:word" xmlns:w="http://schemas.openxmlformats.org/wordprocessingml/2006/main" xmlns:w14="http://schemas.microsoft.com/office/word/2010/wordml" xmlns:w15="http://schemas.microsoft.com/office/word/2012/wordml" xmlns:w16cei="http://schemas.microsoft.com/office/word/2026/wordml/cei" xmlns:w16cex="http://schemas.microsoft.com/office/word/2018/wordml/cex" xmlns:w16cid="http://schemas.microsoft.com/office/word/2016/wordml/cid" xmlns:w16="http://schemas.microsoft.com/office/word/2018/wordml" xmlns:w16du="http://schemas.microsoft.com/office/word/2023/wordml/word16du" xmlns:w16sdtdh="http://schemas.microsoft.com/office/word/2020/wordml/sdtdatahash" xmlns:w16sdtfl="http://schemas.microsoft.com/office/word/2024/wordml/sdtformatlock" xmlns:w16se="http://schemas.microsoft.com/office/word/2015/wordml/symex" xmlns:wpg="http://schemas.microsoft.com/office/word/2010/wordprocessingGroup" xmlns:wpi="http://schemas.microsoft.com/office/word/2010/wordprocessingInk" xmlns:wne="http://schemas.microsoft.com/office/word/2006/wordml" xmlns:wps="http://schemas.microsoft.com/office/word/2010/wordprocessingShape" mc:Ignorable="w14 w15 w16se w16cid w16 w16cex w16sdtdh w16sdtfl w16du wp14">
   <w:body>
     <w:p>
       <w:pPr>
@@ -21,7 +21,7 @@
         <mc:AlternateContent>
           <mc:Choice Requires="wps">
             <w:drawing>
-              <wp:anchor distT="45720" distB="45720" distL="114300" distR="114300" simplePos="0" relativeHeight="251633152" behindDoc="1" locked="0" layoutInCell="1" allowOverlap="1" wp14:anchorId="3829ADDE" wp14:editId="4AF7BA8D">
+              <wp:anchor distT="45720" distB="45720" distL="114300" distR="114300" simplePos="0" relativeHeight="251654656" behindDoc="1" locked="0" layoutInCell="1" allowOverlap="1" wp14:anchorId="3829ADDE" wp14:editId="4AF7BA8D">
                 <wp:simplePos x="0" y="0"/>
                 <wp:positionH relativeFrom="column">
                   <wp:posOffset>5293665</wp:posOffset>
@@ -168,12 +168,360 @@
       </w:pPr>
       <w:r>
         <w:rPr>
+          <w:rFonts w:ascii="Times New Roman" w:hAnsi="Times New Roman" w:cs="Times New Roman"/>
           <w:noProof/>
+          <w:sz w:val="24"/>
         </w:rPr>
         <mc:AlternateContent>
           <mc:Choice Requires="wps">
             <w:drawing>
-              <wp:anchor distT="0" distB="0" distL="114300" distR="114300" simplePos="0" relativeHeight="251676160" behindDoc="1" locked="0" layoutInCell="1" allowOverlap="1" wp14:anchorId="0980D0A7" wp14:editId="0F225C18">
+              <wp:anchor distT="45720" distB="45720" distL="114300" distR="114300" simplePos="0" relativeHeight="251678208" behindDoc="1" locked="0" layoutInCell="1" allowOverlap="1" wp14:anchorId="03F4A378" wp14:editId="23A95D01">
+                <wp:simplePos x="0" y="0"/>
+                <wp:positionH relativeFrom="margin">
+                  <wp:posOffset>3536950</wp:posOffset>
+                </wp:positionH>
+                <wp:positionV relativeFrom="paragraph">
+                  <wp:posOffset>111760</wp:posOffset>
+                </wp:positionV>
+                <wp:extent cx="2009632" cy="246380"/>
+                <wp:effectExtent l="0" t="0" r="10160" b="20320"/>
+                <wp:wrapNone/>
+                <wp:docPr id="535106974" name="Text Box 2"/>
+                <wp:cNvGraphicFramePr>
+                  <a:graphicFrameLocks xmlns:a="http://schemas.openxmlformats.org/drawingml/2006/main"/>
+                </wp:cNvGraphicFramePr>
+                <a:graphic xmlns:a="http://schemas.openxmlformats.org/drawingml/2006/main">
+                  <a:graphicData uri="http://schemas.microsoft.com/office/word/2010/wordprocessingShape">
+                    <wps:wsp>
+                      <wps:cNvSpPr txBox="1">
+                        <a:spLocks noChangeArrowheads="1"/>
+                      </wps:cNvSpPr>
+                      <wps:spPr bwMode="auto">
+                        <a:xfrm>
+                          <a:off x="0" y="0"/>
+                          <a:ext cx="2009632" cy="246380"/>
+                        </a:xfrm>
+                        <a:prstGeom prst="rect">
+                          <a:avLst/>
+                        </a:prstGeom>
+                        <a:solidFill>
+                          <a:srgbClr val="FFFFFF"/>
+                        </a:solidFill>
+                        <a:ln w="9525">
+                          <a:solidFill>
+                            <a:schemeClr val="bg1"/>
+                          </a:solidFill>
+                          <a:miter lim="800000"/>
+                          <a:headEnd/>
+                          <a:tailEnd/>
+                        </a:ln>
+                      </wps:spPr>
+                      <wps:txbx>
+                        <w:txbxContent>
+                          <w:p>
+                            <w:hyperlink r:id="rId5" w:history="1">
+                              <w:r>
+                                <w:rPr>
+                                  <w:rStyle w:val="Hyperlink"/>
+                                  <w:rFonts w:ascii="Times New Roman" w:hAnsi="Times New Roman" w:cs="Times New Roman"/>
+                                  <w:sz w:val="20"/>
+                                  <w:szCs w:val="20"/>
+                                  <w:bdr w:val="none" w:sz="0" w:space="0" w:color="auto" w:frame="1"/>
+                                  <w:shd w:val="clear" w:color="auto" w:fill="FFFFFF"/>
+                                </w:rPr>
+                                <w:t>www.linkedin.com/in/Koby-Miller</w:t>
+                              </w:r>
+                            </w:hyperlink>
+                          </w:p>
+                        </w:txbxContent>
+                      </wps:txbx>
+                      <wps:bodyPr rot="0" vert="horz" wrap="square" lIns="91440" tIns="45720" rIns="91440" bIns="45720" anchor="t" anchorCtr="0">
+                        <a:noAutofit/>
+                      </wps:bodyPr>
+                    </wps:wsp>
+                  </a:graphicData>
+                </a:graphic>
+                <wp14:sizeRelH relativeFrom="margin">
+                  <wp14:pctWidth>0</wp14:pctWidth>
+                </wp14:sizeRelH>
+                <wp14:sizeRelV relativeFrom="margin">
+                  <wp14:pctHeight>0</wp14:pctHeight>
+                </wp14:sizeRelV>
+              </wp:anchor>
+            </w:drawing>
+          </mc:Choice>
+          <mc:Fallback>
+            <w:pict>
+              <v:shapetype w14:anchorId="03F4A378" id="_x0000_t202" coordsize="21600,21600" o:spt="202" path="m,l,21600r21600,l21600,xe">
+                <v:stroke joinstyle="miter"/>
+                <v:path gradientshapeok="t" o:connecttype="rect"/>
+              </v:shapetype>
+              <v:shape id="_x0000_s1027" type="#_x0000_t202" style="position:absolute;left:0;text-align:left;margin-left:278.5pt;margin-top:8.8pt;width:158.25pt;height:19.4pt;z-index:-251638272;visibility:visible;mso-wrap-style:square;mso-width-percent:0;mso-height-percent:0;mso-wrap-distance-left:9pt;mso-wrap-distance-top:3.6pt;mso-wrap-distance-right:9pt;mso-wrap-distance-bottom:3.6pt;mso-position-horizontal:absolute;mso-position-horizontal-relative:margin;mso-position-vertical:absolute;mso-position-vertical-relative:text;mso-width-percent:0;mso-height-percent:0;mso-width-relative:margin;mso-height-relative:margin;v-text-anchor:top" o:gfxdata="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" strokecolor="white [3212]">
+                <v:textbox>
+                  <w:txbxContent>
+                    <w:p>
+                      <w:hyperlink r:id="rId6" w:history="1">
+                        <w:r>
+                          <w:rPr>
+                            <w:rStyle w:val="Hyperlink"/>
+                            <w:rFonts w:ascii="Times New Roman" w:hAnsi="Times New Roman" w:cs="Times New Roman"/>
+                            <w:sz w:val="20"/>
+                            <w:szCs w:val="20"/>
+                            <w:bdr w:val="none" w:sz="0" w:space="0" w:color="auto" w:frame="1"/>
+                            <w:shd w:val="clear" w:color="auto" w:fill="FFFFFF"/>
+                          </w:rPr>
+                          <w:t>www.linkedin.com/in/Koby-Miller</w:t>
+                        </w:r>
+                      </w:hyperlink>
+                    </w:p>
+                  </w:txbxContent>
+                </v:textbox>
+                <w10:wrap anchorx="margin"/>
+              </v:shape>
+            </w:pict>
+          </mc:Fallback>
+        </mc:AlternateContent>
+      </w:r>
+      <w:r>
+        <w:rPr>
+          <w:rFonts w:ascii="Times New Roman" w:hAnsi="Times New Roman" w:cs="Times New Roman"/>
+          <w:noProof/>
+          <w:sz w:val="24"/>
+        </w:rPr>
+        <mc:AlternateContent>
+          <mc:Choice Requires="wps">
+            <w:drawing>
+              <wp:anchor distT="45720" distB="45720" distL="114300" distR="114300" simplePos="0" relativeHeight="251653632" behindDoc="1" locked="0" layoutInCell="1" allowOverlap="1" wp14:anchorId="148117CC" wp14:editId="04B40A7D">
+                <wp:simplePos x="0" y="0"/>
+                <wp:positionH relativeFrom="margin">
+                  <wp:posOffset>5661025</wp:posOffset>
+                </wp:positionH>
+                <wp:positionV relativeFrom="paragraph">
+                  <wp:posOffset>101600</wp:posOffset>
+                </wp:positionV>
+                <wp:extent cx="1369060" cy="246380"/>
+                <wp:effectExtent l="0" t="0" r="21590" b="20320"/>
+                <wp:wrapNone/>
+                <wp:docPr id="24" name="Text Box 2"/>
+                <wp:cNvGraphicFramePr>
+                  <a:graphicFrameLocks xmlns:a="http://schemas.openxmlformats.org/drawingml/2006/main"/>
+                </wp:cNvGraphicFramePr>
+                <a:graphic xmlns:a="http://schemas.openxmlformats.org/drawingml/2006/main">
+                  <a:graphicData uri="http://schemas.microsoft.com/office/word/2010/wordprocessingShape">
+                    <wps:wsp>
+                      <wps:cNvSpPr txBox="1">
+                        <a:spLocks noChangeArrowheads="1"/>
+                      </wps:cNvSpPr>
+                      <wps:spPr bwMode="auto">
+                        <a:xfrm>
+                          <a:off x="0" y="0"/>
+                          <a:ext cx="1369060" cy="246380"/>
+                        </a:xfrm>
+                        <a:prstGeom prst="rect">
+                          <a:avLst/>
+                        </a:prstGeom>
+                        <a:solidFill>
+                          <a:srgbClr val="FFFFFF"/>
+                        </a:solidFill>
+                        <a:ln w="9525">
+                          <a:solidFill>
+                            <a:schemeClr val="bg1"/>
+                          </a:solidFill>
+                          <a:miter lim="800000"/>
+                          <a:headEnd/>
+                          <a:tailEnd/>
+                        </a:ln>
+                      </wps:spPr>
+                      <wps:txbx>
+                        <w:txbxContent>
+                          <w:bookmarkStart w:id="0" w:name="_Hlk106363980"/>
+                          <w:p>
+                            <w:r>
+                              <w:rPr>
+                                <w:rFonts w:ascii="Times New Roman" w:hAnsi="Times New Roman" w:cs="Times New Roman"/>
+                                <w:sz w:val="20"/>
+                                <w:szCs w:val="20"/>
+                                <w:bdr w:val="none" w:sz="0" w:space="0" w:color="auto" w:frame="1"/>
+                                <w:shd w:val="clear" w:color="auto" w:fill="FFFFFF"/>
+                              </w:rPr>
+                              <w:fldChar w:fldCharType="begin"/>
+                            </w:r>
+                            <w:r>
+                              <w:rPr>
+                                <w:rFonts w:ascii="Times New Roman" w:hAnsi="Times New Roman" w:cs="Times New Roman"/>
+                                <w:sz w:val="20"/>
+                                <w:szCs w:val="20"/>
+                                <w:bdr w:val="none" w:sz="0" w:space="0" w:color="auto" w:frame="1"/>
+                                <w:shd w:val="clear" w:color="auto" w:fill="FFFFFF"/>
+                              </w:rPr>
+                              <w:instrText>HYPERLINK "http://</w:instrText>
+                            </w:r>
+                            <w:r>
+                              <w:rPr>
+                                <w:rFonts w:ascii="Times New Roman" w:hAnsi="Times New Roman" w:cs="Times New Roman"/>
+                                <w:sz w:val="20"/>
+                                <w:szCs w:val="20"/>
+                                <w:bdr w:val="none" w:sz="0" w:space="0" w:color="auto" w:frame="1"/>
+                                <w:shd w:val="clear" w:color="auto" w:fill="FFFFFF"/>
+                              </w:rPr>
+                              <w:instrText>www.KobyMiller.com</w:instrText>
+                            </w:r>
+                            <w:r>
+                              <w:rPr>
+                                <w:rFonts w:ascii="Times New Roman" w:hAnsi="Times New Roman" w:cs="Times New Roman"/>
+                                <w:sz w:val="20"/>
+                                <w:szCs w:val="20"/>
+                                <w:bdr w:val="none" w:sz="0" w:space="0" w:color="auto" w:frame="1"/>
+                                <w:shd w:val="clear" w:color="auto" w:fill="FFFFFF"/>
+                              </w:rPr>
+                              <w:instrText>"</w:instrText>
+                            </w:r>
+                            <w:r>
+                              <w:rPr>
+                                <w:rFonts w:ascii="Times New Roman" w:hAnsi="Times New Roman" w:cs="Times New Roman"/>
+                                <w:sz w:val="20"/>
+                                <w:szCs w:val="20"/>
+                                <w:bdr w:val="none" w:sz="0" w:space="0" w:color="auto" w:frame="1"/>
+                                <w:shd w:val="clear" w:color="auto" w:fill="FFFFFF"/>
+                              </w:rPr>
+                              <w:fldChar w:fldCharType="separate"/>
+                            </w:r>
+                            <w:r>
+                              <w:rPr>
+                                <w:rStyle w:val="Hyperlink"/>
+                                <w:rFonts w:ascii="Times New Roman" w:hAnsi="Times New Roman" w:cs="Times New Roman"/>
+                                <w:sz w:val="20"/>
+                                <w:szCs w:val="20"/>
+                                <w:bdr w:val="none" w:sz="0" w:space="0" w:color="auto" w:frame="1"/>
+                                <w:shd w:val="clear" w:color="auto" w:fill="FFFFFF"/>
+                              </w:rPr>
+                              <w:t>www.KobyMiller.com</w:t>
+                            </w:r>
+                            <w:bookmarkEnd w:id="0"/>
+                            <w:r>
+                              <w:rPr>
+                                <w:rFonts w:ascii="Times New Roman" w:hAnsi="Times New Roman" w:cs="Times New Roman"/>
+                                <w:sz w:val="20"/>
+                                <w:szCs w:val="20"/>
+                                <w:bdr w:val="none" w:sz="0" w:space="0" w:color="auto" w:frame="1"/>
+                                <w:shd w:val="clear" w:color="auto" w:fill="FFFFFF"/>
+                              </w:rPr>
+                              <w:fldChar w:fldCharType="end"/>
+                            </w:r>
+                          </w:p>
+                        </w:txbxContent>
+                      </wps:txbx>
+                      <wps:bodyPr rot="0" vert="horz" wrap="square" lIns="91440" tIns="45720" rIns="91440" bIns="45720" anchor="t" anchorCtr="0">
+                        <a:noAutofit/>
+                      </wps:bodyPr>
+                    </wps:wsp>
+                  </a:graphicData>
+                </a:graphic>
+                <wp14:sizeRelH relativeFrom="margin">
+                  <wp14:pctWidth>0</wp14:pctWidth>
+                </wp14:sizeRelH>
+                <wp14:sizeRelV relativeFrom="margin">
+                  <wp14:pctHeight>0</wp14:pctHeight>
+                </wp14:sizeRelV>
+              </wp:anchor>
+            </w:drawing>
+          </mc:Choice>
+          <mc:Fallback>
+            <w:pict>
+              <v:shape w14:anchorId="148117CC" id="_x0000_s1028" type="#_x0000_t202" style="position:absolute;left:0;text-align:left;margin-left:445.75pt;margin-top:8pt;width:107.8pt;height:19.4pt;z-index:-251662848;visibility:visible;mso-wrap-style:square;mso-width-percent:0;mso-height-percent:0;mso-wrap-distance-left:9pt;mso-wrap-distance-top:3.6pt;mso-wrap-distance-right:9pt;mso-wrap-distance-bottom:3.6pt;mso-position-horizontal:absolute;mso-position-horizontal-relative:margin;mso-position-vertical:absolute;mso-position-vertical-relative:text;mso-width-percent:0;mso-height-percent:0;mso-width-relative:margin;mso-height-relative:margin;v-text-anchor:top" o:gfxdata="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" strokecolor="white [3212]">
+                <v:textbox>
+                  <w:txbxContent>
+                    <w:bookmarkStart w:id="1" w:name="_Hlk106363980"/>
+                    <w:p>
+                      <w:r>
+                        <w:rPr>
+                          <w:rFonts w:ascii="Times New Roman" w:hAnsi="Times New Roman" w:cs="Times New Roman"/>
+                          <w:sz w:val="20"/>
+                          <w:szCs w:val="20"/>
+                          <w:bdr w:val="none" w:sz="0" w:space="0" w:color="auto" w:frame="1"/>
+                          <w:shd w:val="clear" w:color="auto" w:fill="FFFFFF"/>
+                        </w:rPr>
+                        <w:fldChar w:fldCharType="begin"/>
+                      </w:r>
+                      <w:r>
+                        <w:rPr>
+                          <w:rFonts w:ascii="Times New Roman" w:hAnsi="Times New Roman" w:cs="Times New Roman"/>
+                          <w:sz w:val="20"/>
+                          <w:szCs w:val="20"/>
+                          <w:bdr w:val="none" w:sz="0" w:space="0" w:color="auto" w:frame="1"/>
+                          <w:shd w:val="clear" w:color="auto" w:fill="FFFFFF"/>
+                        </w:rPr>
+                        <w:instrText>HYPERLINK "http://</w:instrText>
+                      </w:r>
+                      <w:r>
+                        <w:rPr>
+                          <w:rFonts w:ascii="Times New Roman" w:hAnsi="Times New Roman" w:cs="Times New Roman"/>
+                          <w:sz w:val="20"/>
+                          <w:szCs w:val="20"/>
+                          <w:bdr w:val="none" w:sz="0" w:space="0" w:color="auto" w:frame="1"/>
+                          <w:shd w:val="clear" w:color="auto" w:fill="FFFFFF"/>
+                        </w:rPr>
+                        <w:instrText>www.KobyMiller.com</w:instrText>
+                      </w:r>
+                      <w:r>
+                        <w:rPr>
+                          <w:rFonts w:ascii="Times New Roman" w:hAnsi="Times New Roman" w:cs="Times New Roman"/>
+                          <w:sz w:val="20"/>
+                          <w:szCs w:val="20"/>
+                          <w:bdr w:val="none" w:sz="0" w:space="0" w:color="auto" w:frame="1"/>
+                          <w:shd w:val="clear" w:color="auto" w:fill="FFFFFF"/>
+                        </w:rPr>
+                        <w:instrText>"</w:instrText>
+                      </w:r>
+                      <w:r>
+                        <w:rPr>
+                          <w:rFonts w:ascii="Times New Roman" w:hAnsi="Times New Roman" w:cs="Times New Roman"/>
+                          <w:sz w:val="20"/>
+                          <w:szCs w:val="20"/>
+                          <w:bdr w:val="none" w:sz="0" w:space="0" w:color="auto" w:frame="1"/>
+                          <w:shd w:val="clear" w:color="auto" w:fill="FFFFFF"/>
+                        </w:rPr>
+                        <w:fldChar w:fldCharType="separate"/>
+                      </w:r>
+                      <w:r>
+                        <w:rPr>
+                          <w:rStyle w:val="Hyperlink"/>
+                          <w:rFonts w:ascii="Times New Roman" w:hAnsi="Times New Roman" w:cs="Times New Roman"/>
+                          <w:sz w:val="20"/>
+                          <w:szCs w:val="20"/>
+                          <w:bdr w:val="none" w:sz="0" w:space="0" w:color="auto" w:frame="1"/>
+                          <w:shd w:val="clear" w:color="auto" w:fill="FFFFFF"/>
+                        </w:rPr>
+                        <w:t>www.KobyMiller.com</w:t>
+                      </w:r>
+                      <w:bookmarkEnd w:id="1"/>
+                      <w:r>
+                        <w:rPr>
+                          <w:rFonts w:ascii="Times New Roman" w:hAnsi="Times New Roman" w:cs="Times New Roman"/>
+                          <w:sz w:val="20"/>
+                          <w:szCs w:val="20"/>
+                          <w:bdr w:val="none" w:sz="0" w:space="0" w:color="auto" w:frame="1"/>
+                          <w:shd w:val="clear" w:color="auto" w:fill="FFFFFF"/>
+                        </w:rPr>
+                        <w:fldChar w:fldCharType="end"/>
+                      </w:r>
+                    </w:p>
+                  </w:txbxContent>
+                </v:textbox>
+                <w10:wrap anchorx="margin"/>
+              </v:shape>
+            </w:pict>
+          </mc:Fallback>
+        </mc:AlternateContent>
+      </w:r>
+      <w:r>
+        <w:rPr>
+          <w:noProof/>
+        </w:rPr>
+        <mc:AlternateContent>
+          <mc:Choice Requires="wps">
+            <w:drawing>
+              <wp:anchor distT="0" distB="0" distL="114300" distR="114300" simplePos="0" relativeHeight="251668992" behindDoc="1" locked="0" layoutInCell="1" allowOverlap="1" wp14:anchorId="0980D0A7" wp14:editId="7F0E5891">
                 <wp:simplePos x="0" y="0"/>
                 <wp:positionH relativeFrom="column">
                   <wp:posOffset>-1047</wp:posOffset>
@@ -248,7 +596,7 @@
           </mc:Choice>
           <mc:Fallback>
             <w:pict>
-              <v:shape w14:anchorId="0980D0A7" id="Text Box 8" o:spid="_x0000_s1027" type="#_x0000_t202" style="position:absolute;left:0;text-align:left;margin-left:-.1pt;margin-top:6.5pt;width:121.55pt;height:33.4pt;z-index:-251640320;visibility:visible;mso-wrap-style:square;mso-width-percent:0;mso-height-percent:0;mso-wrap-distance-left:9pt;mso-wrap-distance-top:0;mso-wrap-distance-right:9pt;mso-wrap-distance-bottom:0;mso-position-horizontal:absolute;mso-position-horizontal-relative:text;mso-position-vertical:absolute;mso-position-vertical-relative:text;mso-width-percent:0;mso-height-percent:0;mso-width-relative:margin;mso-height-relative:margin;v-text-anchor:top" o:gfxdata="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" fillcolor="white [3201]" stroked="f" strokeweight=".5pt">
+              <v:shape w14:anchorId="0980D0A7" id="Text Box 8" o:spid="_x0000_s1029" type="#_x0000_t202" style="position:absolute;left:0;text-align:left;margin-left:-.1pt;margin-top:6.5pt;width:121.55pt;height:33.4pt;z-index:-251647488;visibility:visible;mso-wrap-style:square;mso-width-percent:0;mso-height-percent:0;mso-wrap-distance-left:9pt;mso-wrap-distance-top:0;mso-wrap-distance-right:9pt;mso-wrap-distance-bottom:0;mso-position-horizontal:absolute;mso-position-horizontal-relative:text;mso-position-vertical:absolute;mso-position-vertical-relative:text;mso-width-percent:0;mso-height-percent:0;mso-width-relative:margin;mso-height-relative:margin;v-text-anchor:top" o:gfxdata="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" fillcolor="white [3201]" stroked="f" strokeweight=".5pt">
                 <v:textbox>
                   <w:txbxContent>
                     <w:p>
@@ -278,180 +626,6 @@
         </mc:AlternateContent>
       </w:r>
       <w:r>
-        <w:rPr>
-          <w:rFonts w:ascii="Times New Roman" w:hAnsi="Times New Roman" w:cs="Times New Roman"/>
-          <w:noProof/>
-          <w:sz w:val="24"/>
-        </w:rPr>
-        <mc:AlternateContent>
-          <mc:Choice Requires="wps">
-            <w:drawing>
-              <wp:anchor distT="45720" distB="45720" distL="114300" distR="114300" simplePos="0" relativeHeight="251630080" behindDoc="1" locked="0" layoutInCell="1" allowOverlap="1" wp14:anchorId="148117CC" wp14:editId="6AAEB236">
-                <wp:simplePos x="0" y="0"/>
-                <wp:positionH relativeFrom="margin">
-                  <wp:align>right</wp:align>
-                </wp:positionH>
-                <wp:positionV relativeFrom="paragraph">
-                  <wp:posOffset>96831</wp:posOffset>
-                </wp:positionV>
-                <wp:extent cx="2009632" cy="246380"/>
-                <wp:effectExtent l="0" t="0" r="10160" b="20320"/>
-                <wp:wrapNone/>
-                <wp:docPr id="24" name="Text Box 2"/>
-                <wp:cNvGraphicFramePr>
-                  <a:graphicFrameLocks xmlns:a="http://schemas.openxmlformats.org/drawingml/2006/main"/>
-                </wp:cNvGraphicFramePr>
-                <a:graphic xmlns:a="http://schemas.openxmlformats.org/drawingml/2006/main">
-                  <a:graphicData uri="http://schemas.microsoft.com/office/word/2010/wordprocessingShape">
-                    <wps:wsp>
-                      <wps:cNvSpPr txBox="1">
-                        <a:spLocks noChangeArrowheads="1"/>
-                      </wps:cNvSpPr>
-                      <wps:spPr bwMode="auto">
-                        <a:xfrm>
-                          <a:off x="0" y="0"/>
-                          <a:ext cx="2009632" cy="246380"/>
-                        </a:xfrm>
-                        <a:prstGeom prst="rect">
-                          <a:avLst/>
-                        </a:prstGeom>
-                        <a:solidFill>
-                          <a:srgbClr val="FFFFFF"/>
-                        </a:solidFill>
-                        <a:ln w="9525">
-                          <a:solidFill>
-                            <a:schemeClr val="bg1"/>
-                          </a:solidFill>
-                          <a:miter lim="800000"/>
-                          <a:headEnd/>
-                          <a:tailEnd/>
-                        </a:ln>
-                      </wps:spPr>
-                      <wps:txbx>
-                        <w:txbxContent>
-                          <w:bookmarkStart w:id="0" w:name="_Hlk106363980"/>
-                          <w:p>
-                            <w:r>
-                              <w:rPr>
-                                <w:rFonts w:asciiTheme="minorHAnsi" w:hAnsiTheme="minorHAnsi" w:cstheme="minorBidi"/>
-                              </w:rPr>
-                              <w:fldChar w:fldCharType="begin"/>
-                            </w:r>
-                            <w:r>
-                              <w:instrText>HYPERLINK "http://www.linkedin.com/in/Koby-Miller"</w:instrText>
-                            </w:r>
-                            <w:r>
-                              <w:rPr>
-                                <w:rFonts w:asciiTheme="minorHAnsi" w:hAnsiTheme="minorHAnsi" w:cstheme="minorBidi"/>
-                              </w:rPr>
-                            </w:r>
-                            <w:r>
-                              <w:rPr>
-                                <w:rFonts w:asciiTheme="minorHAnsi" w:hAnsiTheme="minorHAnsi" w:cstheme="minorBidi"/>
-                              </w:rPr>
-                              <w:fldChar w:fldCharType="separate"/>
-                            </w:r>
-                            <w:r>
-                              <w:rPr>
-                                <w:rStyle w:val="Hyperlink"/>
-                                <w:rFonts w:ascii="Times New Roman" w:hAnsi="Times New Roman" w:cs="Times New Roman"/>
-                                <w:sz w:val="20"/>
-                                <w:szCs w:val="20"/>
-                                <w:bdr w:val="none" w:sz="0" w:space="0" w:color="auto" w:frame="1"/>
-                                <w:shd w:val="clear" w:color="auto" w:fill="FFFFFF"/>
-                              </w:rPr>
-                              <w:t>www.linkedin.com/in/Koby-Miller</w:t>
-                            </w:r>
-                            <w:r>
-                              <w:rPr>
-                                <w:rStyle w:val="Hyperlink"/>
-                                <w:rFonts w:ascii="Times New Roman" w:hAnsi="Times New Roman" w:cs="Times New Roman"/>
-                                <w:sz w:val="20"/>
-                                <w:szCs w:val="20"/>
-                                <w:bdr w:val="none" w:sz="0" w:space="0" w:color="auto" w:frame="1"/>
-                                <w:shd w:val="clear" w:color="auto" w:fill="FFFFFF"/>
-                              </w:rPr>
-                              <w:fldChar w:fldCharType="end"/>
-                            </w:r>
-                            <w:bookmarkEnd w:id="0"/>
-                          </w:p>
-                        </w:txbxContent>
-                      </wps:txbx>
-                      <wps:bodyPr rot="0" vert="horz" wrap="square" lIns="91440" tIns="45720" rIns="91440" bIns="45720" anchor="t" anchorCtr="0">
-                        <a:noAutofit/>
-                      </wps:bodyPr>
-                    </wps:wsp>
-                  </a:graphicData>
-                </a:graphic>
-                <wp14:sizeRelH relativeFrom="margin">
-                  <wp14:pctWidth>0</wp14:pctWidth>
-                </wp14:sizeRelH>
-                <wp14:sizeRelV relativeFrom="margin">
-                  <wp14:pctHeight>0</wp14:pctHeight>
-                </wp14:sizeRelV>
-              </wp:anchor>
-            </w:drawing>
-          </mc:Choice>
-          <mc:Fallback>
-            <w:pict>
-              <v:shape w14:anchorId="148117CC" id="_x0000_s1028" type="#_x0000_t202" style="position:absolute;left:0;text-align:left;margin-left:107.05pt;margin-top:7.6pt;width:158.25pt;height:19.4pt;z-index:-251686400;visibility:visible;mso-wrap-style:square;mso-width-percent:0;mso-height-percent:0;mso-wrap-distance-left:9pt;mso-wrap-distance-top:3.6pt;mso-wrap-distance-right:9pt;mso-wrap-distance-bottom:3.6pt;mso-position-horizontal:right;mso-position-horizontal-relative:margin;mso-position-vertical:absolute;mso-position-vertical-relative:text;mso-width-percent:0;mso-height-percent:0;mso-width-relative:margin;mso-height-relative:margin;v-text-anchor:top" o:gfxdata="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" strokecolor="white [3212]">
-                <v:textbox>
-                  <w:txbxContent>
-                    <w:bookmarkStart w:id="1" w:name="_Hlk106363980"/>
-                    <w:p>
-                      <w:r>
-                        <w:rPr>
-                          <w:rFonts w:asciiTheme="minorHAnsi" w:hAnsiTheme="minorHAnsi" w:cstheme="minorBidi"/>
-                        </w:rPr>
-                        <w:fldChar w:fldCharType="begin"/>
-                      </w:r>
-                      <w:r>
-                        <w:instrText>HYPERLINK "http://www.linkedin.com/in/Koby-Miller"</w:instrText>
-                      </w:r>
-                      <w:r>
-                        <w:rPr>
-                          <w:rFonts w:asciiTheme="minorHAnsi" w:hAnsiTheme="minorHAnsi" w:cstheme="minorBidi"/>
-                        </w:rPr>
-                      </w:r>
-                      <w:r>
-                        <w:rPr>
-                          <w:rFonts w:asciiTheme="minorHAnsi" w:hAnsiTheme="minorHAnsi" w:cstheme="minorBidi"/>
-                        </w:rPr>
-                        <w:fldChar w:fldCharType="separate"/>
-                      </w:r>
-                      <w:r>
-                        <w:rPr>
-                          <w:rStyle w:val="Hyperlink"/>
-                          <w:rFonts w:ascii="Times New Roman" w:hAnsi="Times New Roman" w:cs="Times New Roman"/>
-                          <w:sz w:val="20"/>
-                          <w:szCs w:val="20"/>
-                          <w:bdr w:val="none" w:sz="0" w:space="0" w:color="auto" w:frame="1"/>
-                          <w:shd w:val="clear" w:color="auto" w:fill="FFFFFF"/>
-                        </w:rPr>
-                        <w:t>www.linkedin.com/in/Koby-Miller</w:t>
-                      </w:r>
-                      <w:r>
-                        <w:rPr>
-                          <w:rStyle w:val="Hyperlink"/>
-                          <w:rFonts w:ascii="Times New Roman" w:hAnsi="Times New Roman" w:cs="Times New Roman"/>
-                          <w:sz w:val="20"/>
-                          <w:szCs w:val="20"/>
-                          <w:bdr w:val="none" w:sz="0" w:space="0" w:color="auto" w:frame="1"/>
-                          <w:shd w:val="clear" w:color="auto" w:fill="FFFFFF"/>
-                        </w:rPr>
-                        <w:fldChar w:fldCharType="end"/>
-                      </w:r>
-                      <w:bookmarkEnd w:id="1"/>
-                    </w:p>
-                  </w:txbxContent>
-                </v:textbox>
-                <w10:wrap anchorx="margin"/>
-              </v:shape>
-            </w:pict>
-          </mc:Fallback>
-        </mc:AlternateContent>
-      </w:r>
-      <w:r>
         <w:t>321</w:t>
       </w:r>
       <w:r>
@@ -481,7 +655,7 @@
         </w:rPr>
         <w:t xml:space="preserve"> </w:t>
       </w:r>
-      <w:hyperlink r:id="rId5">
+      <w:hyperlink r:id="rId7">
         <w:r>
           <w:t>KobyLMiller@outlook.com</w:t>
         </w:r>
@@ -557,7 +731,7 @@
         <mc:AlternateContent>
           <mc:Choice Requires="wps">
             <w:drawing>
-              <wp:anchor distT="0" distB="0" distL="114300" distR="114300" simplePos="0" relativeHeight="251693568" behindDoc="0" locked="0" layoutInCell="1" allowOverlap="1" wp14:anchorId="4D91B1C8" wp14:editId="416A2E1A">
+              <wp:anchor distT="0" distB="0" distL="114300" distR="114300" simplePos="0" relativeHeight="251672064" behindDoc="0" locked="0" layoutInCell="1" allowOverlap="1" wp14:anchorId="4D91B1C8" wp14:editId="416A2E1A">
                 <wp:simplePos x="0" y="0"/>
                 <wp:positionH relativeFrom="column">
                   <wp:posOffset>3664291</wp:posOffset>
@@ -715,7 +889,7 @@
         <mc:AlternateContent>
           <mc:Choice Requires="wps">
             <w:drawing>
-              <wp:anchor distT="0" distB="0" distL="114300" distR="114300" simplePos="0" relativeHeight="251729408" behindDoc="1" locked="0" layoutInCell="1" allowOverlap="1" wp14:anchorId="3D4F35B5" wp14:editId="742D0E0B">
+              <wp:anchor distT="0" distB="0" distL="114300" distR="114300" simplePos="0" relativeHeight="251676160" behindDoc="1" locked="0" layoutInCell="1" allowOverlap="1" wp14:anchorId="3D4F35B5" wp14:editId="742D0E0B">
                 <wp:simplePos x="0" y="0"/>
                 <wp:positionH relativeFrom="column">
                   <wp:posOffset>3805004</wp:posOffset>
@@ -837,7 +1011,7 @@
         <mc:AlternateContent>
           <mc:Choice Requires="wps">
             <w:drawing>
-              <wp:anchor distT="0" distB="0" distL="114300" distR="114300" simplePos="0" relativeHeight="251705856" behindDoc="0" locked="0" layoutInCell="1" allowOverlap="1" wp14:anchorId="126A2D2B" wp14:editId="21776660">
+              <wp:anchor distT="0" distB="0" distL="114300" distR="114300" simplePos="0" relativeHeight="251673088" behindDoc="0" locked="0" layoutInCell="1" allowOverlap="1" wp14:anchorId="126A2D2B" wp14:editId="21776660">
                 <wp:simplePos x="0" y="0"/>
                 <wp:positionH relativeFrom="page">
                   <wp:posOffset>4155473</wp:posOffset>
@@ -1028,7 +1202,7 @@
         <mc:AlternateContent>
           <mc:Choice Requires="wps">
             <w:drawing>
-              <wp:anchor distT="0" distB="0" distL="114300" distR="114300" simplePos="0" relativeHeight="251723264" behindDoc="1" locked="0" layoutInCell="1" allowOverlap="1" wp14:anchorId="7BAD6C80" wp14:editId="03F137F4">
+              <wp:anchor distT="0" distB="0" distL="114300" distR="114300" simplePos="0" relativeHeight="251675136" behindDoc="1" locked="0" layoutInCell="1" allowOverlap="1" wp14:anchorId="7BAD6C80" wp14:editId="03F137F4">
                 <wp:simplePos x="0" y="0"/>
                 <wp:positionH relativeFrom="column">
                   <wp:posOffset>3805004</wp:posOffset>
@@ -1134,7 +1308,7 @@
         <mc:AlternateContent>
           <mc:Choice Requires="wps">
             <w:drawing>
-              <wp:anchor distT="45720" distB="45720" distL="114300" distR="114300" simplePos="0" relativeHeight="251652608" behindDoc="0" locked="0" layoutInCell="1" allowOverlap="1" wp14:anchorId="74E1D271" wp14:editId="349BB109">
+              <wp:anchor distT="45720" distB="45720" distL="114300" distR="114300" simplePos="0" relativeHeight="251657728" behindDoc="0" locked="0" layoutInCell="1" allowOverlap="1" wp14:anchorId="74E1D271" wp14:editId="349BB109">
                 <wp:simplePos x="0" y="0"/>
                 <wp:positionH relativeFrom="margin">
                   <wp:posOffset>5347606</wp:posOffset>
@@ -1350,7 +1524,7 @@
         <mc:AlternateContent>
           <mc:Choice Requires="wps">
             <w:drawing>
-              <wp:anchor distT="0" distB="0" distL="114300" distR="114300" simplePos="0" relativeHeight="251617792" behindDoc="1" locked="0" layoutInCell="1" allowOverlap="1" wp14:anchorId="64880C26" wp14:editId="67EBE6E8">
+              <wp:anchor distT="0" distB="0" distL="114300" distR="114300" simplePos="0" relativeHeight="251651584" behindDoc="1" locked="0" layoutInCell="1" allowOverlap="1" wp14:anchorId="64880C26" wp14:editId="67EBE6E8">
                 <wp:simplePos x="0" y="0"/>
                 <wp:positionH relativeFrom="margin">
                   <wp:posOffset>-1587</wp:posOffset>
@@ -1463,7 +1637,7 @@
         <mc:AlternateContent>
           <mc:Choice Requires="wps">
             <w:drawing>
-              <wp:anchor distT="0" distB="0" distL="114300" distR="114300" simplePos="0" relativeHeight="251715072" behindDoc="0" locked="0" layoutInCell="1" allowOverlap="1" wp14:anchorId="44A03309" wp14:editId="7C9F3CED">
+              <wp:anchor distT="0" distB="0" distL="114300" distR="114300" simplePos="0" relativeHeight="251674112" behindDoc="0" locked="0" layoutInCell="1" allowOverlap="1" wp14:anchorId="44A03309" wp14:editId="7C9F3CED">
                 <wp:simplePos x="0" y="0"/>
                 <wp:positionH relativeFrom="page">
                   <wp:posOffset>4155106</wp:posOffset>
@@ -1670,7 +1844,7 @@
         <mc:AlternateContent>
           <mc:Choice Requires="wpg">
             <w:drawing>
-              <wp:anchor distT="0" distB="0" distL="114300" distR="114300" simplePos="0" relativeHeight="251686400" behindDoc="0" locked="0" layoutInCell="1" allowOverlap="1" wp14:anchorId="685E0DD0" wp14:editId="3433C71B">
+              <wp:anchor distT="0" distB="0" distL="114300" distR="114300" simplePos="0" relativeHeight="251671040" behindDoc="0" locked="0" layoutInCell="1" allowOverlap="1" wp14:anchorId="685E0DD0" wp14:editId="3433C71B">
                 <wp:simplePos x="0" y="0"/>
                 <wp:positionH relativeFrom="column">
                   <wp:posOffset>65932</wp:posOffset>
@@ -1856,7 +2030,7 @@
         <mc:AlternateContent>
           <mc:Choice Requires="wps">
             <w:drawing>
-              <wp:anchor distT="45720" distB="45720" distL="114300" distR="114300" simplePos="0" relativeHeight="251638272" behindDoc="1" locked="0" layoutInCell="1" allowOverlap="1" wp14:anchorId="5FC9C37D" wp14:editId="1CBC9382">
+              <wp:anchor distT="45720" distB="45720" distL="114300" distR="114300" simplePos="0" relativeHeight="251655680" behindDoc="1" locked="0" layoutInCell="1" allowOverlap="1" wp14:anchorId="5FC9C37D" wp14:editId="1CBC9382">
                 <wp:simplePos x="0" y="0"/>
                 <wp:positionH relativeFrom="margin">
                   <wp:posOffset>2796540</wp:posOffset>
@@ -2011,7 +2185,7 @@
         <mc:AlternateContent>
           <mc:Choice Requires="wps">
             <w:drawing>
-              <wp:anchor distT="0" distB="0" distL="114300" distR="114300" simplePos="0" relativeHeight="251571712" behindDoc="0" locked="0" layoutInCell="1" allowOverlap="1" wp14:anchorId="38766536" wp14:editId="5EB862CE">
+              <wp:anchor distT="0" distB="0" distL="114300" distR="114300" simplePos="0" relativeHeight="251639296" behindDoc="0" locked="0" layoutInCell="1" allowOverlap="1" wp14:anchorId="38766536" wp14:editId="5EB862CE">
                 <wp:simplePos x="0" y="0"/>
                 <wp:positionH relativeFrom="page">
                   <wp:posOffset>479425</wp:posOffset>
@@ -2234,7 +2408,7 @@
         <mc:AlternateContent>
           <mc:Choice Requires="wps">
             <w:drawing>
-              <wp:anchor distT="0" distB="0" distL="114300" distR="114300" simplePos="0" relativeHeight="251575808" behindDoc="0" locked="0" layoutInCell="1" allowOverlap="1" wp14:anchorId="320FC2C7" wp14:editId="62B3615C">
+              <wp:anchor distT="0" distB="0" distL="114300" distR="114300" simplePos="0" relativeHeight="251640320" behindDoc="0" locked="0" layoutInCell="1" allowOverlap="1" wp14:anchorId="320FC2C7" wp14:editId="62B3615C">
                 <wp:simplePos x="0" y="0"/>
                 <wp:positionH relativeFrom="page">
                   <wp:posOffset>479425</wp:posOffset>
@@ -2454,7 +2628,7 @@
         <mc:AlternateContent>
           <mc:Choice Requires="wps">
             <w:drawing>
-              <wp:anchor distT="0" distB="0" distL="114300" distR="114300" simplePos="0" relativeHeight="251577856" behindDoc="0" locked="0" layoutInCell="1" allowOverlap="1" wp14:anchorId="14281261" wp14:editId="16AAEF2D">
+              <wp:anchor distT="0" distB="0" distL="114300" distR="114300" simplePos="0" relativeHeight="251641344" behindDoc="0" locked="0" layoutInCell="1" allowOverlap="1" wp14:anchorId="14281261" wp14:editId="16AAEF2D">
                 <wp:simplePos x="0" y="0"/>
                 <wp:positionH relativeFrom="page">
                   <wp:posOffset>479425</wp:posOffset>
@@ -2719,7 +2893,7 @@
         <mc:AlternateContent>
           <mc:Choice Requires="wps">
             <w:drawing>
-              <wp:anchor distT="45720" distB="45720" distL="114300" distR="114300" simplePos="0" relativeHeight="251676160" behindDoc="1" locked="0" layoutInCell="1" allowOverlap="1" wp14:anchorId="518BBAB6" wp14:editId="6322A94B">
+              <wp:anchor distT="45720" distB="45720" distL="114300" distR="114300" simplePos="0" relativeHeight="251670016" behindDoc="1" locked="0" layoutInCell="1" allowOverlap="1" wp14:anchorId="518BBAB6" wp14:editId="6322A94B">
                 <wp:simplePos x="0" y="0"/>
                 <wp:positionH relativeFrom="margin">
                   <wp:posOffset>2816295</wp:posOffset>
@@ -2838,7 +3012,7 @@
         <mc:AlternateContent>
           <mc:Choice Requires="wps">
             <w:drawing>
-              <wp:anchor distT="0" distB="0" distL="114300" distR="114300" simplePos="0" relativeHeight="251668992" behindDoc="0" locked="0" layoutInCell="1" allowOverlap="1" wp14:anchorId="64571F4D" wp14:editId="57FC35D3">
+              <wp:anchor distT="0" distB="0" distL="114300" distR="114300" simplePos="0" relativeHeight="251662848" behindDoc="0" locked="0" layoutInCell="1" allowOverlap="1" wp14:anchorId="64571F4D" wp14:editId="57FC35D3">
                 <wp:simplePos x="0" y="0"/>
                 <wp:positionH relativeFrom="page">
                   <wp:posOffset>479425</wp:posOffset>
@@ -3056,7 +3230,6 @@
       <w:r>
         <w:t xml:space="preserve"> </w:t>
       </w:r>
-      <w:proofErr w:type="gramStart"/>
       <w:r>
         <w:t>Modified</w:t>
       </w:r>
@@ -3072,7 +3245,6 @@
       <w:r>
         <w:t>scripts,</w:t>
       </w:r>
-      <w:proofErr w:type="gramEnd"/>
       <w:r>
         <w:t xml:space="preserve"> </w:t>
       </w:r>
@@ -3141,7 +3313,7 @@
         <mc:AlternateContent>
           <mc:Choice Requires="wps">
             <w:drawing>
-              <wp:anchor distT="45720" distB="45720" distL="114300" distR="114300" simplePos="0" relativeHeight="251675136" behindDoc="1" locked="0" layoutInCell="1" allowOverlap="1" wp14:anchorId="4F5A3055" wp14:editId="335BC85F">
+              <wp:anchor distT="45720" distB="45720" distL="114300" distR="114300" simplePos="0" relativeHeight="251667968" behindDoc="1" locked="0" layoutInCell="1" allowOverlap="1" wp14:anchorId="4F5A3055" wp14:editId="335BC85F">
                 <wp:simplePos x="0" y="0"/>
                 <wp:positionH relativeFrom="margin">
                   <wp:align>right</wp:align>
@@ -3296,7 +3468,7 @@
         <mc:AlternateContent>
           <mc:Choice Requires="wps">
             <w:drawing>
-              <wp:anchor distT="0" distB="0" distL="114300" distR="114300" simplePos="0" relativeHeight="251670016" behindDoc="0" locked="0" layoutInCell="1" allowOverlap="1" wp14:anchorId="76B1E794" wp14:editId="01A9C39C">
+              <wp:anchor distT="0" distB="0" distL="114300" distR="114300" simplePos="0" relativeHeight="251663872" behindDoc="0" locked="0" layoutInCell="1" allowOverlap="1" wp14:anchorId="76B1E794" wp14:editId="01A9C39C">
                 <wp:simplePos x="0" y="0"/>
                 <wp:positionH relativeFrom="page">
                   <wp:posOffset>479425</wp:posOffset>
@@ -3648,7 +3820,7 @@
         <mc:AlternateContent>
           <mc:Choice Requires="wps">
             <w:drawing>
-              <wp:anchor distT="0" distB="0" distL="114300" distR="114300" simplePos="0" relativeHeight="251671040" behindDoc="0" locked="0" layoutInCell="1" allowOverlap="1" wp14:anchorId="317F7C2E" wp14:editId="68C1F6FC">
+              <wp:anchor distT="0" distB="0" distL="114300" distR="114300" simplePos="0" relativeHeight="251664896" behindDoc="0" locked="0" layoutInCell="1" allowOverlap="1" wp14:anchorId="317F7C2E" wp14:editId="68C1F6FC">
                 <wp:simplePos x="0" y="0"/>
                 <wp:positionH relativeFrom="page">
                   <wp:posOffset>479425</wp:posOffset>
@@ -3878,7 +4050,7 @@
         <mc:AlternateContent>
           <mc:Choice Requires="wps">
             <w:drawing>
-              <wp:anchor distT="45720" distB="45720" distL="114300" distR="114300" simplePos="0" relativeHeight="251674112" behindDoc="1" locked="0" layoutInCell="1" allowOverlap="1" wp14:anchorId="5BB99C56" wp14:editId="04CFCF99">
+              <wp:anchor distT="45720" distB="45720" distL="114300" distR="114300" simplePos="0" relativeHeight="251666944" behindDoc="1" locked="0" layoutInCell="1" allowOverlap="1" wp14:anchorId="5BB99C56" wp14:editId="04CFCF99">
                 <wp:simplePos x="0" y="0"/>
                 <wp:positionH relativeFrom="margin">
                   <wp:align>right</wp:align>
@@ -4033,7 +4205,7 @@
         <mc:AlternateContent>
           <mc:Choice Requires="wps">
             <w:drawing>
-              <wp:anchor distT="0" distB="0" distL="114300" distR="114300" simplePos="0" relativeHeight="251673088" behindDoc="0" locked="0" layoutInCell="1" allowOverlap="1" wp14:anchorId="3AB1E184" wp14:editId="7F80A1E5">
+              <wp:anchor distT="0" distB="0" distL="114300" distR="114300" simplePos="0" relativeHeight="251665920" behindDoc="0" locked="0" layoutInCell="1" allowOverlap="1" wp14:anchorId="3AB1E184" wp14:editId="7F80A1E5">
                 <wp:simplePos x="0" y="0"/>
                 <wp:positionH relativeFrom="page">
                   <wp:posOffset>479425</wp:posOffset>
@@ -4272,7 +4444,7 @@
         <mc:AlternateContent>
           <mc:Choice Requires="wps">
             <w:drawing>
-              <wp:anchor distT="0" distB="0" distL="114300" distR="114300" simplePos="0" relativeHeight="251653632" behindDoc="0" locked="0" layoutInCell="1" allowOverlap="1" wp14:anchorId="123D0B41" wp14:editId="53E36E5A">
+              <wp:anchor distT="0" distB="0" distL="114300" distR="114300" simplePos="0" relativeHeight="251658752" behindDoc="0" locked="0" layoutInCell="1" allowOverlap="1" wp14:anchorId="123D0B41" wp14:editId="53E36E5A">
                 <wp:simplePos x="0" y="0"/>
                 <wp:positionH relativeFrom="page">
                   <wp:posOffset>479425</wp:posOffset>
@@ -4878,10 +5050,13 @@
         <w:spacing w:before="82" w:line="264" w:lineRule="auto"/>
       </w:pPr>
       <w:r>
+        <w:rPr>
+          <w:noProof/>
+        </w:rPr>
         <mc:AlternateContent>
           <mc:Choice Requires="wps">
             <w:drawing>
-              <wp:anchor distT="45720" distB="45720" distL="114300" distR="114300" simplePos="0" relativeHeight="251642368" behindDoc="1" locked="0" layoutInCell="1" allowOverlap="1" wp14:anchorId="31019616" wp14:editId="0973A55E">
+              <wp:anchor distT="45720" distB="45720" distL="114300" distR="114300" simplePos="0" relativeHeight="251656704" behindDoc="1" locked="0" layoutInCell="1" allowOverlap="1" wp14:anchorId="31019616" wp14:editId="0973A55E">
                 <wp:simplePos x="0" y="0"/>
                 <wp:positionH relativeFrom="margin">
                   <wp:posOffset>3195927</wp:posOffset>
@@ -5069,10 +5244,13 @@
         </mc:AlternateContent>
       </w:r>
       <w:r>
+        <w:rPr>
+          <w:noProof/>
+        </w:rPr>
         <mc:AlternateContent>
           <mc:Choice Requires="wps">
             <w:drawing>
-              <wp:anchor distT="0" distB="0" distL="114300" distR="114300" simplePos="0" relativeHeight="251580928" behindDoc="0" locked="0" layoutInCell="1" allowOverlap="1" wp14:anchorId="638B4671" wp14:editId="36A64247">
+              <wp:anchor distT="0" distB="0" distL="114300" distR="114300" simplePos="0" relativeHeight="251642368" behindDoc="0" locked="0" layoutInCell="1" allowOverlap="1" wp14:anchorId="638B4671" wp14:editId="36A64247">
                 <wp:simplePos x="0" y="0"/>
                 <wp:positionH relativeFrom="page">
                   <wp:posOffset>479425</wp:posOffset>
@@ -5257,10 +5435,13 @@
         </mc:AlternateContent>
       </w:r>
       <w:r>
+        <w:rPr>
+          <w:noProof/>
+        </w:rPr>
         <mc:AlternateContent>
           <mc:Choice Requires="wps">
             <w:drawing>
-              <wp:anchor distT="0" distB="0" distL="114300" distR="114300" simplePos="0" relativeHeight="251584000" behindDoc="0" locked="0" layoutInCell="1" allowOverlap="1" wp14:anchorId="57E1F1C5" wp14:editId="234968B9">
+              <wp:anchor distT="0" distB="0" distL="114300" distR="114300" simplePos="0" relativeHeight="251643392" behindDoc="0" locked="0" layoutInCell="1" allowOverlap="1" wp14:anchorId="57E1F1C5" wp14:editId="234968B9">
                 <wp:simplePos x="0" y="0"/>
                 <wp:positionH relativeFrom="page">
                   <wp:posOffset>479425</wp:posOffset>
@@ -5488,7 +5669,7 @@
         <mc:AlternateContent>
           <mc:Choice Requires="wps">
             <w:drawing>
-              <wp:anchor distT="0" distB="0" distL="114300" distR="114300" simplePos="0" relativeHeight="251618816" behindDoc="1" locked="0" layoutInCell="1" allowOverlap="1" wp14:anchorId="2AD68900" wp14:editId="60063F13">
+              <wp:anchor distT="0" distB="0" distL="114300" distR="114300" simplePos="0" relativeHeight="251652608" behindDoc="1" locked="0" layoutInCell="1" allowOverlap="1" wp14:anchorId="2AD68900" wp14:editId="60063F13">
                 <wp:simplePos x="0" y="0"/>
                 <wp:positionH relativeFrom="margin">
                   <wp:align>left</wp:align>
@@ -5612,7 +5793,7 @@
         <mc:AlternateContent>
           <mc:Choice Requires="wpg">
             <w:drawing>
-              <wp:anchor distT="0" distB="0" distL="114300" distR="114300" simplePos="0" relativeHeight="251659776" behindDoc="0" locked="0" layoutInCell="1" allowOverlap="1" wp14:anchorId="041F1888" wp14:editId="0638C5BE">
+              <wp:anchor distT="0" distB="0" distL="114300" distR="114300" simplePos="0" relativeHeight="251660800" behindDoc="0" locked="0" layoutInCell="1" allowOverlap="1" wp14:anchorId="041F1888" wp14:editId="0638C5BE">
                 <wp:simplePos x="0" y="0"/>
                 <wp:positionH relativeFrom="column">
                   <wp:posOffset>66675</wp:posOffset>
@@ -5720,7 +5901,7 @@
         </w:rPr>
         <w:t xml:space="preserve"> </w:t>
       </w:r>
-      <w:hyperlink r:id="rId6" w:history="1">
+      <w:hyperlink r:id="rId8" w:history="1">
         <w:r>
           <w:rPr>
             <w:color w:val="0000ED"/>
@@ -5746,10 +5927,13 @@
         <w:ind w:left="700"/>
       </w:pPr>
       <w:r>
+        <w:rPr>
+          <w:noProof/>
+        </w:rPr>
         <mc:AlternateContent>
           <mc:Choice Requires="wps">
             <w:drawing>
-              <wp:anchor distT="0" distB="0" distL="114300" distR="114300" simplePos="0" relativeHeight="251585024" behindDoc="0" locked="0" layoutInCell="1" allowOverlap="1" wp14:anchorId="46DC2C9E" wp14:editId="52434D42">
+              <wp:anchor distT="0" distB="0" distL="114300" distR="114300" simplePos="0" relativeHeight="251644416" behindDoc="0" locked="0" layoutInCell="1" allowOverlap="1" wp14:anchorId="46DC2C9E" wp14:editId="52434D42">
                 <wp:simplePos x="0" y="0"/>
                 <wp:positionH relativeFrom="page">
                   <wp:posOffset>669925</wp:posOffset>
@@ -5956,7 +6140,7 @@
         <mc:AlternateContent>
           <mc:Choice Requires="wps">
             <w:drawing>
-              <wp:anchor distT="45720" distB="45720" distL="114300" distR="114300" simplePos="0" relativeHeight="251656704" behindDoc="1" locked="0" layoutInCell="1" allowOverlap="1" wp14:anchorId="25E453A0" wp14:editId="570D427E">
+              <wp:anchor distT="45720" distB="45720" distL="114300" distR="114300" simplePos="0" relativeHeight="251659776" behindDoc="1" locked="0" layoutInCell="1" allowOverlap="1" wp14:anchorId="25E453A0" wp14:editId="570D427E">
                 <wp:simplePos x="0" y="0"/>
                 <wp:positionH relativeFrom="margin">
                   <wp:posOffset>4089065</wp:posOffset>
@@ -6033,7 +6217,27 @@
                                 <w:sz w:val="18"/>
                                 <w:szCs w:val="18"/>
                               </w:rPr>
-                              <w:t>, JavaScript, ElectronJS, C++)</w:t>
+                              <w:t xml:space="preserve">, JavaScript, </w:t>
+                            </w:r>
+                            <w:proofErr w:type="spellStart"/>
+                            <w:r>
+                              <w:rPr>
+                                <w:b/>
+                                <w:bCs/>
+                                <w:sz w:val="18"/>
+                                <w:szCs w:val="18"/>
+                              </w:rPr>
+                              <w:t>ElectronJS</w:t>
+                            </w:r>
+                            <w:proofErr w:type="spellEnd"/>
+                            <w:r>
+                              <w:rPr>
+                                <w:b/>
+                                <w:bCs/>
+                                <w:sz w:val="18"/>
+                                <w:szCs w:val="18"/>
+                              </w:rPr>
+                              <w:t>, C++)</w:t>
                             </w:r>
                           </w:p>
                         </w:txbxContent>
@@ -6106,10 +6310,13 @@
         </mc:AlternateContent>
       </w:r>
       <w:r>
+        <w:rPr>
+          <w:noProof/>
+        </w:rPr>
         <mc:AlternateContent>
           <mc:Choice Requires="wps">
             <w:drawing>
-              <wp:anchor distT="0" distB="0" distL="114300" distR="114300" simplePos="0" relativeHeight="251588096" behindDoc="0" locked="0" layoutInCell="1" allowOverlap="1" wp14:anchorId="07A88557" wp14:editId="7AF7C4D3">
+              <wp:anchor distT="0" distB="0" distL="114300" distR="114300" simplePos="0" relativeHeight="251645440" behindDoc="0" locked="0" layoutInCell="1" allowOverlap="1" wp14:anchorId="07A88557" wp14:editId="7AF7C4D3">
                 <wp:simplePos x="0" y="0"/>
                 <wp:positionH relativeFrom="page">
                   <wp:posOffset>669925</wp:posOffset>
@@ -6294,10 +6501,13 @@
         </mc:AlternateContent>
       </w:r>
       <w:r>
+        <w:rPr>
+          <w:noProof/>
+        </w:rPr>
         <mc:AlternateContent>
           <mc:Choice Requires="wps">
             <w:drawing>
-              <wp:anchor distT="0" distB="0" distL="114300" distR="114300" simplePos="0" relativeHeight="251591168" behindDoc="0" locked="0" layoutInCell="1" allowOverlap="1" wp14:anchorId="67100935" wp14:editId="0E46C96B">
+              <wp:anchor distT="0" distB="0" distL="114300" distR="114300" simplePos="0" relativeHeight="251646464" behindDoc="0" locked="0" layoutInCell="1" allowOverlap="1" wp14:anchorId="67100935" wp14:editId="0E46C96B">
                 <wp:simplePos x="0" y="0"/>
                 <wp:positionH relativeFrom="page">
                   <wp:posOffset>669925</wp:posOffset>
@@ -6482,10 +6692,13 @@
         </mc:AlternateContent>
       </w:r>
       <w:r>
+        <w:rPr>
+          <w:noProof/>
+        </w:rPr>
         <mc:AlternateContent>
           <mc:Choice Requires="wps">
             <w:drawing>
-              <wp:anchor distT="0" distB="0" distL="114300" distR="114300" simplePos="0" relativeHeight="251594240" behindDoc="0" locked="0" layoutInCell="1" allowOverlap="1" wp14:anchorId="6D3E35B4" wp14:editId="4CA9BD9A">
+              <wp:anchor distT="0" distB="0" distL="114300" distR="114300" simplePos="0" relativeHeight="251647488" behindDoc="0" locked="0" layoutInCell="1" allowOverlap="1" wp14:anchorId="6D3E35B4" wp14:editId="4CA9BD9A">
                 <wp:simplePos x="0" y="0"/>
                 <wp:positionH relativeFrom="page">
                   <wp:posOffset>669925</wp:posOffset>
@@ -6670,10 +6883,7 @@
         </mc:AlternateContent>
       </w:r>
       <w:r>
-        <w:t>P</w:t>
-      </w:r>
-      <w:r>
-        <w:t xml:space="preserve">rogrammed dynamic visual effects using the </w:t>
+        <w:t xml:space="preserve">Programmed dynamic visual effects using the </w:t>
       </w:r>
       <w:proofErr w:type="spellStart"/>
       <w:r>
@@ -6707,7 +6917,13 @@
       </w:r>
       <w:proofErr w:type="spellEnd"/>
       <w:r>
-        <w:t xml:space="preserve"> 2020</w:t>
+        <w:t xml:space="preserve"> </w:t>
+      </w:r>
+      <w:r>
+        <w:t xml:space="preserve">VI </w:t>
+      </w:r>
+      <w:r>
+        <w:t>2020</w:t>
       </w:r>
       <w:r>
         <w:t>.</w:t>
@@ -6768,10 +6984,13 @@
         <w:ind w:left="700"/>
       </w:pPr>
       <w:r>
+        <w:rPr>
+          <w:noProof/>
+        </w:rPr>
         <mc:AlternateContent>
           <mc:Choice Requires="wps">
             <w:drawing>
-              <wp:anchor distT="0" distB="0" distL="114300" distR="114300" simplePos="0" relativeHeight="251596288" behindDoc="0" locked="0" layoutInCell="1" allowOverlap="1" wp14:anchorId="069F3979" wp14:editId="26DB8B79">
+              <wp:anchor distT="0" distB="0" distL="114300" distR="114300" simplePos="0" relativeHeight="251648512" behindDoc="0" locked="0" layoutInCell="1" allowOverlap="1" wp14:anchorId="069F3979" wp14:editId="26DB8B79">
                 <wp:simplePos x="0" y="0"/>
                 <wp:positionH relativeFrom="page">
                   <wp:posOffset>669925</wp:posOffset>
@@ -6975,7 +7194,7 @@
         <mc:AlternateContent>
           <mc:Choice Requires="wps">
             <w:drawing>
-              <wp:anchor distT="0" distB="0" distL="114300" distR="114300" simplePos="0" relativeHeight="251601408" behindDoc="0" locked="0" layoutInCell="1" allowOverlap="1" wp14:anchorId="256C8CD5" wp14:editId="4F826238">
+              <wp:anchor distT="0" distB="0" distL="114300" distR="114300" simplePos="0" relativeHeight="251649536" behindDoc="0" locked="0" layoutInCell="1" allowOverlap="1" wp14:anchorId="256C8CD5" wp14:editId="4F826238">
                 <wp:simplePos x="0" y="0"/>
                 <wp:positionH relativeFrom="page">
                   <wp:posOffset>669925</wp:posOffset>
@@ -7190,7 +7409,7 @@
         <mc:AlternateContent>
           <mc:Choice Requires="wps">
             <w:drawing>
-              <wp:anchor distT="45720" distB="45720" distL="114300" distR="114300" simplePos="0" relativeHeight="251662848" behindDoc="1" locked="0" layoutInCell="1" allowOverlap="1" wp14:anchorId="01C4E957" wp14:editId="32BCC6C6">
+              <wp:anchor distT="45720" distB="45720" distL="114300" distR="114300" simplePos="0" relativeHeight="251661824" behindDoc="1" locked="0" layoutInCell="1" allowOverlap="1" wp14:anchorId="01C4E957" wp14:editId="32BCC6C6">
                 <wp:simplePos x="0" y="0"/>
                 <wp:positionH relativeFrom="margin">
                   <wp:posOffset>3644418</wp:posOffset>
@@ -7386,7 +7605,7 @@
         <mc:AlternateContent>
           <mc:Choice Requires="wps">
             <w:drawing>
-              <wp:anchor distT="0" distB="0" distL="114300" distR="114300" simplePos="0" relativeHeight="251606528" behindDoc="0" locked="0" layoutInCell="1" allowOverlap="1" wp14:anchorId="506391DB" wp14:editId="57FEE033">
+              <wp:anchor distT="0" distB="0" distL="114300" distR="114300" simplePos="0" relativeHeight="251650560" behindDoc="0" locked="0" layoutInCell="1" allowOverlap="1" wp14:anchorId="506391DB" wp14:editId="57FEE033">
                 <wp:simplePos x="0" y="0"/>
                 <wp:positionH relativeFrom="page">
                   <wp:posOffset>669925</wp:posOffset>
@@ -7587,7 +7806,7 @@
 </file>
 
 <file path=word/numbering.xml><?xml version="1.0" encoding="utf-8"?>
-<w:numbering xmlns:wpc="http://schemas.microsoft.com/office/word/2010/wordprocessingCanvas" xmlns:cx="http://schemas.microsoft.com/office/drawing/2014/chartex" xmlns:cx1="http://schemas.microsoft.com/office/drawing/2015/9/8/chartex" xmlns:cx2="http://schemas.microsoft.com/office/drawing/2015/10/21/chartex" xmlns:cx3="http://schemas.microsoft.com/office/drawing/2016/5/9/chartex" xmlns:cx4="http://schemas.microsoft.com/office/drawing/2016/5/10/chartex" xmlns:cx5="http://schemas.microsoft.com/office/drawing/2016/5/11/chartex" xmlns:cx6="http://schemas.microsoft.com/office/drawing/2016/5/12/chartex" xmlns:cx7="http://schemas.microsoft.com/office/drawing/2016/5/13/chartex" xmlns:cx8="http://schemas.microsoft.com/office/drawing/2016/5/14/chartex" xmlns:mc="http://schemas.openxmlformats.org/markup-compatibility/2006" xmlns:aink="http://schemas.microsoft.com/office/drawing/2016/ink" xmlns:am3d="http://schemas.microsoft.com/office/drawing/2017/model3d" xmlns:o="urn:schemas-microsoft-com:office:office" xmlns:oel="http://schemas.microsoft.com/office/2019/extlst" xmlns:r="http://schemas.openxmlformats.org/officeDocument/2006/relationships" xmlns:m="http://schemas.openxmlformats.org/officeDocument/2006/math" xmlns:v="urn:schemas-microsoft-com:vml" xmlns:wp14="http://schemas.microsoft.com/office/word/2010/wordprocessingDrawing" xmlns:wp="http://schemas.openxmlformats.org/drawingml/2006/wordprocessingDrawing" xmlns:w10="urn:schemas-microsoft-com:office:word" xmlns:w="http://schemas.openxmlformats.org/wordprocessingml/2006/main" xmlns:w14="http://schemas.microsoft.com/office/word/2010/wordml" xmlns:w15="http://schemas.microsoft.com/office/word/2012/wordml" xmlns:w16cex="http://schemas.microsoft.com/office/word/2018/wordml/cex" xmlns:w16cid="http://schemas.microsoft.com/office/word/2016/wordml/cid" xmlns:w16="http://schemas.microsoft.com/office/word/2018/wordml" xmlns:w16du="http://schemas.microsoft.com/office/word/2023/wordml/word16du" xmlns:w16sdtdh="http://schemas.microsoft.com/office/word/2020/wordml/sdtdatahash" xmlns:w16sdtfl="http://schemas.microsoft.com/office/word/2024/wordml/sdtformatlock" xmlns:w16se="http://schemas.microsoft.com/office/word/2015/wordml/symex" xmlns:wpg="http://schemas.microsoft.com/office/word/2010/wordprocessingGroup" xmlns:wpi="http://schemas.microsoft.com/office/word/2010/wordprocessingInk" xmlns:wne="http://schemas.microsoft.com/office/word/2006/wordml" xmlns:wps="http://schemas.microsoft.com/office/word/2010/wordprocessingShape" mc:Ignorable="w14 w15 w16se w16cid w16 w16cex w16sdtdh w16sdtfl w16du wp14">
+<w:numbering xmlns:wpc="http://schemas.microsoft.com/office/word/2010/wordprocessingCanvas" xmlns:cx="http://schemas.microsoft.com/office/drawing/2014/chartex" xmlns:cx1="http://schemas.microsoft.com/office/drawing/2015/9/8/chartex" xmlns:cx2="http://schemas.microsoft.com/office/drawing/2015/10/21/chartex" xmlns:cx3="http://schemas.microsoft.com/office/drawing/2016/5/9/chartex" xmlns:cx4="http://schemas.microsoft.com/office/drawing/2016/5/10/chartex" xmlns:cx5="http://schemas.microsoft.com/office/drawing/2016/5/11/chartex" xmlns:cx6="http://schemas.microsoft.com/office/drawing/2016/5/12/chartex" xmlns:cx7="http://schemas.microsoft.com/office/drawing/2016/5/13/chartex" xmlns:cx8="http://schemas.microsoft.com/office/drawing/2016/5/14/chartex" xmlns:mc="http://schemas.openxmlformats.org/markup-compatibility/2006" xmlns:aink="http://schemas.microsoft.com/office/drawing/2016/ink" xmlns:am3d="http://schemas.microsoft.com/office/drawing/2017/model3d" xmlns:o="urn:schemas-microsoft-com:office:office" xmlns:oel="http://schemas.microsoft.com/office/2019/extlst" xmlns:r="http://schemas.openxmlformats.org/officeDocument/2006/relationships" xmlns:m="http://schemas.openxmlformats.org/officeDocument/2006/math" xmlns:v="urn:schemas-microsoft-com:vml" xmlns:wp14="http://schemas.microsoft.com/office/word/2010/wordprocessingDrawing" xmlns:wp="http://schemas.openxmlformats.org/drawingml/2006/wordprocessingDrawing" xmlns:w10="urn:schemas-microsoft-com:office:word" xmlns:w="http://schemas.openxmlformats.org/wordprocessingml/2006/main" xmlns:w14="http://schemas.microsoft.com/office/word/2010/wordml" xmlns:w15="http://schemas.microsoft.com/office/word/2012/wordml" xmlns:w16cei="http://schemas.microsoft.com/office/word/2026/wordml/cei" xmlns:w16cex="http://schemas.microsoft.com/office/word/2018/wordml/cex" xmlns:w16cid="http://schemas.microsoft.com/office/word/2016/wordml/cid" xmlns:w16="http://schemas.microsoft.com/office/word/2018/wordml" xmlns:w16du="http://schemas.microsoft.com/office/word/2023/wordml/word16du" xmlns:w16sdtdh="http://schemas.microsoft.com/office/word/2020/wordml/sdtdatahash" xmlns:w16sdtfl="http://schemas.microsoft.com/office/word/2024/wordml/sdtformatlock" xmlns:w16se="http://schemas.microsoft.com/office/word/2015/wordml/symex" xmlns:wpg="http://schemas.microsoft.com/office/word/2010/wordprocessingGroup" xmlns:wpi="http://schemas.microsoft.com/office/word/2010/wordprocessingInk" xmlns:wne="http://schemas.microsoft.com/office/word/2006/wordml" xmlns:wps="http://schemas.microsoft.com/office/word/2010/wordprocessingShape" mc:Ignorable="w14 w15 w16se w16cid w16 w16cex w16sdtdh w16sdtfl w16du wp14">
   <w:abstractNum w:abstractNumId="0" w15:restartNumberingAfterBreak="0">
     <w:nsid w:val="13FB2E1E"/>
     <w:multiLevelType w:val="multilevel"/>
@@ -8266,6 +8485,7 @@
   <w:style w:type="character" w:default="1" w:styleId="DefaultParagraphFont">
     <w:name w:val="Default Paragraph Font"/>
     <w:uiPriority w:val="1"/>
+    <w:semiHidden/>
     <w:unhideWhenUsed/>
   </w:style>
   <w:style w:type="table" w:default="1" w:styleId="TableNormal">

</xml_diff>